<commit_message>
Cambios roles en PC
</commit_message>
<xml_diff>
--- a/2.1.GestiónConfiguraciónFormPCs/Peticion_Cambio_2.docx
+++ b/2.1.GestiónConfiguraciónFormPCs/Peticion_Cambio_2.docx
@@ -1126,15 +1126,23 @@
                 <w:sz w:val="16"/>
                 <w:lang w:val="es-ES_tradnl"/>
               </w:rPr>
-              <w:t xml:space="preserve">: </w:t>
-            </w:r>
-            <w:r>
-              <w:rPr>
-                <w:rFonts w:ascii="Times" w:hAnsi="Times"/>
-                <w:sz w:val="16"/>
-                <w:lang w:val="es-ES_tradnl"/>
-              </w:rPr>
-              <w:t>Autor,</w:t>
+              <w:t>:</w:t>
+            </w:r>
+            <w:r>
+              <w:rPr>
+                <w:rFonts w:ascii="Times" w:hAnsi="Times"/>
+                <w:sz w:val="16"/>
+                <w:lang w:val="es-ES_tradnl"/>
+              </w:rPr>
+              <w:t xml:space="preserve"> Moderador</w:t>
+            </w:r>
+            <w:r>
+              <w:rPr>
+                <w:rFonts w:ascii="Times" w:hAnsi="Times"/>
+                <w:sz w:val="16"/>
+                <w:lang w:val="es-ES_tradnl"/>
+              </w:rPr>
+              <w:t>,</w:t>
             </w:r>
             <w:r>
               <w:rPr>
@@ -1217,25 +1225,15 @@
                 <w:sz w:val="16"/>
                 <w:lang w:val="es-ES_tradnl"/>
               </w:rPr>
-              <w:t xml:space="preserve">Moderador, </w:t>
-            </w:r>
-            <w:proofErr w:type="gramStart"/>
-            <w:r>
-              <w:rPr>
-                <w:rFonts w:ascii="Times" w:hAnsi="Times"/>
-                <w:sz w:val="16"/>
-                <w:lang w:val="es-ES_tradnl"/>
-              </w:rPr>
-              <w:t>Responsable</w:t>
-            </w:r>
-            <w:proofErr w:type="gramEnd"/>
-            <w:r>
-              <w:rPr>
-                <w:rFonts w:ascii="Times" w:hAnsi="Times"/>
-                <w:sz w:val="16"/>
-                <w:lang w:val="es-ES_tradnl"/>
-              </w:rPr>
-              <w:t xml:space="preserve"> de Calidad</w:t>
+              <w:t>Inspector</w:t>
+            </w:r>
+            <w:r>
+              <w:rPr>
+                <w:rFonts w:ascii="Times" w:hAnsi="Times"/>
+                <w:sz w:val="16"/>
+                <w:lang w:val="es-ES_tradnl"/>
+              </w:rPr>
+              <w:t>, Responsable de Calidad</w:t>
             </w:r>
             <w:r>
               <w:rPr>

</xml_diff>